<commit_message>
Align BP grid estimates with marking scheme
Co-Authored-By: Claude Opus 5.5 <noreply@anthropic.com>
Claude-Session: https://claude.ai/code/session_0191GkvowkQwD7tFy4wy6pBY
</commit_message>
<xml_diff>
--- a/شبكة-التشخيصي-رياضيات-BP.docx
+++ b/شبكة-التشخيصي-رياضيات-BP.docx
@@ -2714,30 +2714,30 @@
               <w:bottom w:color="808080" w:space="0" w:sz="4" w:val="single"/>
               <w:right w:color="808080" w:space="0" w:sz="4" w:val="single"/>
             </w:tcBorders>
-            <w:shd w:val="clear" w:color="auto" w:fill="D9EAD3"/>
-            <w:tcMar>
-              <w:top w:w="60.0" w:type="dxa"/>
-              <w:bottom w:w="60.0" w:type="dxa"/>
-            </w:tcMar>
-            <w:vAlign w:val="center"/>
-          </w:tcPr>
-          <w:p>
-            <w:pPr>
-              <w:jc w:val="center"/>
-              <w:rPr>
-                <w:sz w:val="24"/>
-                <w:szCs w:val="24"/>
-              </w:rPr>
-            </w:pPr>
-            <w:r>
-              <w:rPr>
-                <w:b w:val="1"/>
-                <w:bCs w:val="1"/>
-                <w:sz w:val="24"/>
-                <w:szCs w:val="24"/>
-                <w:rtl w:val="1"/>
-              </w:rPr>
-              <w:t xml:space="preserve">أ</w:t>
+            <w:shd w:val="clear" w:color="auto" w:fill="FFF2CC"/>
+            <w:tcMar>
+              <w:top w:w="60.0" w:type="dxa"/>
+              <w:bottom w:w="60.0" w:type="dxa"/>
+            </w:tcMar>
+            <w:vAlign w:val="center"/>
+          </w:tcPr>
+          <w:p>
+            <w:pPr>
+              <w:jc w:val="center"/>
+              <w:rPr>
+                <w:sz w:val="24"/>
+                <w:szCs w:val="24"/>
+              </w:rPr>
+            </w:pPr>
+            <w:r>
+              <w:rPr>
+                <w:b w:val="1"/>
+                <w:bCs w:val="1"/>
+                <w:sz w:val="24"/>
+                <w:szCs w:val="24"/>
+                <w:rtl w:val="1"/>
+              </w:rPr>
+              <w:t xml:space="preserve">ب</w:t>
             </w:r>
           </w:p>
         </w:tc>

</xml_diff>

<commit_message>
Correct Haidar's score to 20 in BP grid
Co-Authored-By: Claude Opus 5.5 <noreply@anthropic.com>
Claude-Session: https://claude.ai/code/session_0191GkvowkQwD7tFy4wy6pBY
</commit_message>
<xml_diff>
--- a/شبكة-التشخيصي-رياضيات-BP.docx
+++ b/شبكة-التشخيصي-رياضيات-BP.docx
@@ -2216,204 +2216,204 @@
               <w:bottom w:color="808080" w:space="0" w:sz="4" w:val="single"/>
               <w:right w:color="808080" w:space="0" w:sz="4" w:val="single"/>
             </w:tcBorders>
-            <w:shd w:val="clear" w:color="auto" w:fill="F4CCCC"/>
-            <w:tcMar>
-              <w:top w:w="60.0" w:type="dxa"/>
-              <w:bottom w:w="60.0" w:type="dxa"/>
-            </w:tcMar>
-            <w:vAlign w:val="center"/>
-          </w:tcPr>
-          <w:p>
-            <w:pPr>
-              <w:jc w:val="center"/>
-              <w:rPr>
-                <w:sz w:val="24"/>
-                <w:szCs w:val="24"/>
-              </w:rPr>
-            </w:pPr>
-            <w:r>
-              <w:rPr>
-                <w:b w:val="1"/>
-                <w:bCs w:val="1"/>
-                <w:sz w:val="24"/>
-                <w:szCs w:val="24"/>
-                <w:rtl w:val="1"/>
-              </w:rPr>
-              <w:t xml:space="preserve">ج</w:t>
-            </w:r>
-          </w:p>
-        </w:tc>
-        <w:tc>
-          <w:tcPr>
-            <w:tcBorders>
-              <w:top w:color="808080" w:space="0" w:sz="4" w:val="single"/>
-              <w:left w:color="808080" w:space="0" w:sz="4" w:val="single"/>
-              <w:bottom w:color="808080" w:space="0" w:sz="4" w:val="single"/>
-              <w:right w:color="808080" w:space="0" w:sz="4" w:val="single"/>
-            </w:tcBorders>
-            <w:shd w:val="clear" w:color="auto" w:fill="F4CCCC"/>
-            <w:tcMar>
-              <w:top w:w="60.0" w:type="dxa"/>
-              <w:bottom w:w="60.0" w:type="dxa"/>
-            </w:tcMar>
-            <w:vAlign w:val="center"/>
-          </w:tcPr>
-          <w:p>
-            <w:pPr>
-              <w:jc w:val="center"/>
-              <w:rPr>
-                <w:sz w:val="24"/>
-                <w:szCs w:val="24"/>
-              </w:rPr>
-            </w:pPr>
-            <w:r>
-              <w:rPr>
-                <w:b w:val="1"/>
-                <w:bCs w:val="1"/>
-                <w:sz w:val="24"/>
-                <w:szCs w:val="24"/>
-                <w:rtl w:val="1"/>
-              </w:rPr>
-              <w:t xml:space="preserve">ج</w:t>
-            </w:r>
-          </w:p>
-        </w:tc>
-        <w:tc>
-          <w:tcPr>
-            <w:tcBorders>
-              <w:top w:color="808080" w:space="0" w:sz="4" w:val="single"/>
-              <w:left w:color="808080" w:space="0" w:sz="4" w:val="single"/>
-              <w:bottom w:color="808080" w:space="0" w:sz="4" w:val="single"/>
-              <w:right w:color="808080" w:space="0" w:sz="4" w:val="single"/>
-            </w:tcBorders>
-            <w:shd w:val="clear" w:color="auto" w:fill="F4CCCC"/>
-            <w:tcMar>
-              <w:top w:w="60.0" w:type="dxa"/>
-              <w:bottom w:w="60.0" w:type="dxa"/>
-            </w:tcMar>
-            <w:vAlign w:val="center"/>
-          </w:tcPr>
-          <w:p>
-            <w:pPr>
-              <w:jc w:val="center"/>
-              <w:rPr>
-                <w:sz w:val="24"/>
-                <w:szCs w:val="24"/>
-              </w:rPr>
-            </w:pPr>
-            <w:r>
-              <w:rPr>
-                <w:b w:val="1"/>
-                <w:bCs w:val="1"/>
-                <w:sz w:val="24"/>
-                <w:szCs w:val="24"/>
-                <w:rtl w:val="1"/>
-              </w:rPr>
-              <w:t xml:space="preserve">ج</w:t>
-            </w:r>
-          </w:p>
-        </w:tc>
-        <w:tc>
-          <w:tcPr>
-            <w:tcBorders>
-              <w:top w:color="808080" w:space="0" w:sz="4" w:val="single"/>
-              <w:left w:color="808080" w:space="0" w:sz="4" w:val="single"/>
-              <w:bottom w:color="808080" w:space="0" w:sz="4" w:val="single"/>
-              <w:right w:color="808080" w:space="0" w:sz="4" w:val="single"/>
-            </w:tcBorders>
-            <w:shd w:val="clear" w:color="auto" w:fill="F4CCCC"/>
-            <w:tcMar>
-              <w:top w:w="60.0" w:type="dxa"/>
-              <w:bottom w:w="60.0" w:type="dxa"/>
-            </w:tcMar>
-            <w:vAlign w:val="center"/>
-          </w:tcPr>
-          <w:p>
-            <w:pPr>
-              <w:jc w:val="center"/>
-              <w:rPr>
-                <w:sz w:val="24"/>
-                <w:szCs w:val="24"/>
-              </w:rPr>
-            </w:pPr>
-            <w:r>
-              <w:rPr>
-                <w:b w:val="1"/>
-                <w:bCs w:val="1"/>
-                <w:sz w:val="24"/>
-                <w:szCs w:val="24"/>
-                <w:rtl w:val="1"/>
-              </w:rPr>
-              <w:t xml:space="preserve">ج</w:t>
-            </w:r>
-          </w:p>
-        </w:tc>
-        <w:tc>
-          <w:tcPr>
-            <w:tcBorders>
-              <w:top w:color="808080" w:space="0" w:sz="4" w:val="single"/>
-              <w:left w:color="808080" w:space="0" w:sz="4" w:val="single"/>
-              <w:bottom w:color="808080" w:space="0" w:sz="4" w:val="single"/>
-              <w:right w:color="808080" w:space="0" w:sz="4" w:val="single"/>
-            </w:tcBorders>
-            <w:shd w:val="clear" w:color="auto" w:fill="F4CCCC"/>
-            <w:tcMar>
-              <w:top w:w="60.0" w:type="dxa"/>
-              <w:bottom w:w="60.0" w:type="dxa"/>
-            </w:tcMar>
-            <w:vAlign w:val="center"/>
-          </w:tcPr>
-          <w:p>
-            <w:pPr>
-              <w:jc w:val="center"/>
-              <w:rPr>
-                <w:sz w:val="24"/>
-                <w:szCs w:val="24"/>
-              </w:rPr>
-            </w:pPr>
-            <w:r>
-              <w:rPr>
-                <w:b w:val="1"/>
-                <w:bCs w:val="1"/>
-                <w:sz w:val="24"/>
-                <w:szCs w:val="24"/>
-                <w:rtl w:val="1"/>
-              </w:rPr>
-              <w:t xml:space="preserve">ج</w:t>
-            </w:r>
-          </w:p>
-        </w:tc>
-        <w:tc>
-          <w:tcPr>
-            <w:tcBorders>
-              <w:top w:color="808080" w:space="0" w:sz="4" w:val="single"/>
-              <w:left w:color="808080" w:space="0" w:sz="4" w:val="single"/>
-              <w:bottom w:color="808080" w:space="0" w:sz="4" w:val="single"/>
-              <w:right w:color="808080" w:space="0" w:sz="4" w:val="single"/>
-            </w:tcBorders>
-            <w:tcMar>
-              <w:top w:w="60.0" w:type="dxa"/>
-              <w:bottom w:w="60.0" w:type="dxa"/>
-            </w:tcMar>
-            <w:vAlign w:val="center"/>
-          </w:tcPr>
-          <w:p>
-            <w:pPr>
-              <w:jc w:val="center"/>
-              <w:rPr>
-                <w:sz w:val="24"/>
-                <w:szCs w:val="24"/>
-              </w:rPr>
-            </w:pPr>
-            <w:r>
-              <w:rPr>
-                <w:b w:val="1"/>
-                <w:bCs w:val="1"/>
-                <w:sz w:val="24"/>
-                <w:szCs w:val="24"/>
-                <w:rtl w:val="1"/>
-              </w:rPr>
-              <w:t xml:space="preserve">1</w:t>
+            <w:shd w:val="clear" w:color="auto" w:fill="D9EAD3"/>
+            <w:tcMar>
+              <w:top w:w="60.0" w:type="dxa"/>
+              <w:bottom w:w="60.0" w:type="dxa"/>
+            </w:tcMar>
+            <w:vAlign w:val="center"/>
+          </w:tcPr>
+          <w:p>
+            <w:pPr>
+              <w:jc w:val="center"/>
+              <w:rPr>
+                <w:sz w:val="24"/>
+                <w:szCs w:val="24"/>
+              </w:rPr>
+            </w:pPr>
+            <w:r>
+              <w:rPr>
+                <w:b w:val="1"/>
+                <w:bCs w:val="1"/>
+                <w:sz w:val="24"/>
+                <w:szCs w:val="24"/>
+                <w:rtl w:val="1"/>
+              </w:rPr>
+              <w:t xml:space="preserve">أ</w:t>
+            </w:r>
+          </w:p>
+        </w:tc>
+        <w:tc>
+          <w:tcPr>
+            <w:tcBorders>
+              <w:top w:color="808080" w:space="0" w:sz="4" w:val="single"/>
+              <w:left w:color="808080" w:space="0" w:sz="4" w:val="single"/>
+              <w:bottom w:color="808080" w:space="0" w:sz="4" w:val="single"/>
+              <w:right w:color="808080" w:space="0" w:sz="4" w:val="single"/>
+            </w:tcBorders>
+            <w:shd w:val="clear" w:color="auto" w:fill="D9EAD3"/>
+            <w:tcMar>
+              <w:top w:w="60.0" w:type="dxa"/>
+              <w:bottom w:w="60.0" w:type="dxa"/>
+            </w:tcMar>
+            <w:vAlign w:val="center"/>
+          </w:tcPr>
+          <w:p>
+            <w:pPr>
+              <w:jc w:val="center"/>
+              <w:rPr>
+                <w:sz w:val="24"/>
+                <w:szCs w:val="24"/>
+              </w:rPr>
+            </w:pPr>
+            <w:r>
+              <w:rPr>
+                <w:b w:val="1"/>
+                <w:bCs w:val="1"/>
+                <w:sz w:val="24"/>
+                <w:szCs w:val="24"/>
+                <w:rtl w:val="1"/>
+              </w:rPr>
+              <w:t xml:space="preserve">أ</w:t>
+            </w:r>
+          </w:p>
+        </w:tc>
+        <w:tc>
+          <w:tcPr>
+            <w:tcBorders>
+              <w:top w:color="808080" w:space="0" w:sz="4" w:val="single"/>
+              <w:left w:color="808080" w:space="0" w:sz="4" w:val="single"/>
+              <w:bottom w:color="808080" w:space="0" w:sz="4" w:val="single"/>
+              <w:right w:color="808080" w:space="0" w:sz="4" w:val="single"/>
+            </w:tcBorders>
+            <w:shd w:val="clear" w:color="auto" w:fill="D9EAD3"/>
+            <w:tcMar>
+              <w:top w:w="60.0" w:type="dxa"/>
+              <w:bottom w:w="60.0" w:type="dxa"/>
+            </w:tcMar>
+            <w:vAlign w:val="center"/>
+          </w:tcPr>
+          <w:p>
+            <w:pPr>
+              <w:jc w:val="center"/>
+              <w:rPr>
+                <w:sz w:val="24"/>
+                <w:szCs w:val="24"/>
+              </w:rPr>
+            </w:pPr>
+            <w:r>
+              <w:rPr>
+                <w:b w:val="1"/>
+                <w:bCs w:val="1"/>
+                <w:sz w:val="24"/>
+                <w:szCs w:val="24"/>
+                <w:rtl w:val="1"/>
+              </w:rPr>
+              <w:t xml:space="preserve">أ</w:t>
+            </w:r>
+          </w:p>
+        </w:tc>
+        <w:tc>
+          <w:tcPr>
+            <w:tcBorders>
+              <w:top w:color="808080" w:space="0" w:sz="4" w:val="single"/>
+              <w:left w:color="808080" w:space="0" w:sz="4" w:val="single"/>
+              <w:bottom w:color="808080" w:space="0" w:sz="4" w:val="single"/>
+              <w:right w:color="808080" w:space="0" w:sz="4" w:val="single"/>
+            </w:tcBorders>
+            <w:shd w:val="clear" w:color="auto" w:fill="D9EAD3"/>
+            <w:tcMar>
+              <w:top w:w="60.0" w:type="dxa"/>
+              <w:bottom w:w="60.0" w:type="dxa"/>
+            </w:tcMar>
+            <w:vAlign w:val="center"/>
+          </w:tcPr>
+          <w:p>
+            <w:pPr>
+              <w:jc w:val="center"/>
+              <w:rPr>
+                <w:sz w:val="24"/>
+                <w:szCs w:val="24"/>
+              </w:rPr>
+            </w:pPr>
+            <w:r>
+              <w:rPr>
+                <w:b w:val="1"/>
+                <w:bCs w:val="1"/>
+                <w:sz w:val="24"/>
+                <w:szCs w:val="24"/>
+                <w:rtl w:val="1"/>
+              </w:rPr>
+              <w:t xml:space="preserve">أ</w:t>
+            </w:r>
+          </w:p>
+        </w:tc>
+        <w:tc>
+          <w:tcPr>
+            <w:tcBorders>
+              <w:top w:color="808080" w:space="0" w:sz="4" w:val="single"/>
+              <w:left w:color="808080" w:space="0" w:sz="4" w:val="single"/>
+              <w:bottom w:color="808080" w:space="0" w:sz="4" w:val="single"/>
+              <w:right w:color="808080" w:space="0" w:sz="4" w:val="single"/>
+            </w:tcBorders>
+            <w:shd w:val="clear" w:color="auto" w:fill="D9EAD3"/>
+            <w:tcMar>
+              <w:top w:w="60.0" w:type="dxa"/>
+              <w:bottom w:w="60.0" w:type="dxa"/>
+            </w:tcMar>
+            <w:vAlign w:val="center"/>
+          </w:tcPr>
+          <w:p>
+            <w:pPr>
+              <w:jc w:val="center"/>
+              <w:rPr>
+                <w:sz w:val="24"/>
+                <w:szCs w:val="24"/>
+              </w:rPr>
+            </w:pPr>
+            <w:r>
+              <w:rPr>
+                <w:b w:val="1"/>
+                <w:bCs w:val="1"/>
+                <w:sz w:val="24"/>
+                <w:szCs w:val="24"/>
+                <w:rtl w:val="1"/>
+              </w:rPr>
+              <w:t xml:space="preserve">أ</w:t>
+            </w:r>
+          </w:p>
+        </w:tc>
+        <w:tc>
+          <w:tcPr>
+            <w:tcBorders>
+              <w:top w:color="808080" w:space="0" w:sz="4" w:val="single"/>
+              <w:left w:color="808080" w:space="0" w:sz="4" w:val="single"/>
+              <w:bottom w:color="808080" w:space="0" w:sz="4" w:val="single"/>
+              <w:right w:color="808080" w:space="0" w:sz="4" w:val="single"/>
+            </w:tcBorders>
+            <w:tcMar>
+              <w:top w:w="60.0" w:type="dxa"/>
+              <w:bottom w:w="60.0" w:type="dxa"/>
+            </w:tcMar>
+            <w:vAlign w:val="center"/>
+          </w:tcPr>
+          <w:p>
+            <w:pPr>
+              <w:jc w:val="center"/>
+              <w:rPr>
+                <w:sz w:val="24"/>
+                <w:szCs w:val="24"/>
+              </w:rPr>
+            </w:pPr>
+            <w:r>
+              <w:rPr>
+                <w:b w:val="1"/>
+                <w:bCs w:val="1"/>
+                <w:sz w:val="24"/>
+                <w:szCs w:val="24"/>
+                <w:rtl w:val="1"/>
+              </w:rPr>
+              <w:t xml:space="preserve">20</w:t>
             </w:r>
           </w:p>
         </w:tc>
@@ -3912,7 +3912,7 @@
                 <w:szCs w:val="24"/>
                 <w:rtl w:val="1"/>
               </w:rPr>
-              <w:t xml:space="preserve">13.00</w:t>
+              <w:t xml:space="preserve">15.38</w:t>
             </w:r>
           </w:p>
         </w:tc>
@@ -4009,7 +4009,7 @@
                 <w:szCs w:val="21"/>
                 <w:rtl w:val="0"/>
               </w:rPr>
-              <w:t xml:space="preserve"> 87.5٪</w:t>
+              <w:t xml:space="preserve"> 100٪</w:t>
             </w:r>
             <w:r>
               <w:rPr>
@@ -4046,7 +4046,7 @@
                 <w:szCs w:val="21"/>
                 <w:rtl w:val="0"/>
               </w:rPr>
-              <w:t xml:space="preserve"> 65.00/100</w:t>
+              <w:t xml:space="preserve"> 76.88/100</w:t>
             </w:r>
             <w:r>
               <w:rPr>
@@ -4550,7 +4550,7 @@
           <w:szCs w:val="24"/>
           <w:rtl w:val="1"/>
         </w:rPr>
-        <w:t xml:space="preserve">الفئة ج محصورة بتلميذ واحد في جميع الأهداف.</w:t>
+        <w:t xml:space="preserve">لا توجد فئة ج في أي هدف.</w:t>
       </w:r>
     </w:p>
     <w:p>
@@ -4605,7 +4605,7 @@
           <w:szCs w:val="24"/>
           <w:rtl w:val="1"/>
         </w:rPr>
-        <w:t xml:space="preserve">مصطفى عواصة، هادي عيتاوي، حسين عواضة.</w:t>
+        <w:t xml:space="preserve">حيدر الشيخ، مصطفى عواصة، هادي عيتاوي، حسين عواضة.</w:t>
       </w:r>
     </w:p>
     <w:p>
@@ -4641,36 +4641,6 @@
     <w:p>
       <w:pPr>
         <w:bidi w:val="1"/>
-        <w:spacing w:after="60" w:line="276" w:lineRule="auto"/>
-        <w:ind w:left="-180" w:right="180" w:firstLine="0"/>
-        <w:jc w:val="both"/>
-        <w:rPr>
-          <w:sz w:val="24"/>
-          <w:szCs w:val="24"/>
-        </w:rPr>
-      </w:pPr>
-      <w:r>
-        <w:rPr>
-          <w:b w:val="1"/>
-          <w:bCs w:val="1"/>
-          <w:sz w:val="24"/>
-          <w:szCs w:val="24"/>
-          <w:rtl w:val="1"/>
-        </w:rPr>
-        <w:t xml:space="preserve">- حالة تستدعي متابعة خاصة: </w:t>
-      </w:r>
-      <w:r>
-        <w:rPr>
-          <w:sz w:val="24"/>
-          <w:szCs w:val="24"/>
-          <w:rtl w:val="1"/>
-        </w:rPr>
-        <w:t xml:space="preserve">حيدر الشيخ (ج في جميع الأهداف).</w:t>
-      </w:r>
-    </w:p>
-    <w:p>
-      <w:pPr>
-        <w:bidi w:val="1"/>
         <w:rPr>
           <w:sz w:val="28"/>
           <w:szCs w:val="28"/>
@@ -4724,7 +4694,7 @@
           <w:szCs w:val="24"/>
           <w:rtl w:val="1"/>
         </w:rPr>
-        <w:t xml:space="preserve">مستوى الصف متوسط إلى جيد (نسبة النجاح 87.5%، المعدل 65/100). أهداف خطة الدعم:</w:t>
+        <w:t xml:space="preserve">مستوى الصف جيد (نسبة النجاح 100%، المعدل 76.88/100). أهداف خطة الدعم:</w:t>
       </w:r>
     </w:p>
     <w:p>
@@ -4837,36 +4807,6 @@
           <w:rtl w:val="1"/>
         </w:rPr>
         <w:t xml:space="preserve">4- </w:t>
-      </w:r>
-      <w:r>
-        <w:rPr>
-          <w:sz w:val="24"/>
-          <w:szCs w:val="24"/>
-          <w:rtl w:val="1"/>
-        </w:rPr>
-        <w:t xml:space="preserve">خطة علاجية فردية لحيدر الشيخ تبدأ من المكتسبات الأساسية، مع التواصل مع الأهل.</w:t>
-      </w:r>
-    </w:p>
-    <w:p>
-      <w:pPr>
-        <w:bidi w:val="1"/>
-        <w:spacing w:after="60" w:line="276" w:lineRule="auto"/>
-        <w:ind w:left="-180" w:right="180" w:firstLine="0"/>
-        <w:jc w:val="both"/>
-        <w:rPr>
-          <w:sz w:val="24"/>
-          <w:szCs w:val="24"/>
-        </w:rPr>
-      </w:pPr>
-      <w:r>
-        <w:rPr>
-          <w:b w:val="1"/>
-          <w:bCs w:val="1"/>
-          <w:sz w:val="24"/>
-          <w:szCs w:val="24"/>
-          <w:rtl w:val="1"/>
-        </w:rPr>
-        <w:t xml:space="preserve">5- </w:t>
       </w:r>
       <w:r>
         <w:rPr>

</xml_diff>

<commit_message>
Update BP grid with corrected scores, average, and ج categories
Co-Authored-By: Claude Opus 5.5 <noreply@anthropic.com>
Claude-Session: https://claude.ai/code/session_0191GkvowkQwD7tFy4wy6pBY
</commit_message>
<xml_diff>
--- a/شبكة-التشخيصي-رياضيات-BP.docx
+++ b/شبكة-التشخيصي-رياضيات-BP.docx
@@ -1823,65 +1823,65 @@
               <w:bottom w:color="808080" w:space="0" w:sz="4" w:val="single"/>
               <w:right w:color="808080" w:space="0" w:sz="4" w:val="single"/>
             </w:tcBorders>
-            <w:shd w:val="clear" w:color="auto" w:fill="FFF2CC"/>
-            <w:tcMar>
-              <w:top w:w="60.0" w:type="dxa"/>
-              <w:bottom w:w="60.0" w:type="dxa"/>
-            </w:tcMar>
-            <w:vAlign w:val="center"/>
-          </w:tcPr>
-          <w:p>
-            <w:pPr>
-              <w:jc w:val="center"/>
-              <w:rPr>
-                <w:sz w:val="24"/>
-                <w:szCs w:val="24"/>
-              </w:rPr>
-            </w:pPr>
-            <w:r>
-              <w:rPr>
-                <w:b w:val="1"/>
-                <w:bCs w:val="1"/>
-                <w:sz w:val="24"/>
-                <w:szCs w:val="24"/>
-                <w:rtl w:val="1"/>
-              </w:rPr>
-              <w:t xml:space="preserve">ب</w:t>
-            </w:r>
-          </w:p>
-        </w:tc>
-        <w:tc>
-          <w:tcPr>
-            <w:tcBorders>
-              <w:top w:color="808080" w:space="0" w:sz="4" w:val="single"/>
-              <w:left w:color="808080" w:space="0" w:sz="4" w:val="single"/>
-              <w:bottom w:color="808080" w:space="0" w:sz="4" w:val="single"/>
-              <w:right w:color="808080" w:space="0" w:sz="4" w:val="single"/>
-            </w:tcBorders>
-            <w:shd w:val="clear" w:color="auto" w:fill="FFF2CC"/>
-            <w:tcMar>
-              <w:top w:w="60.0" w:type="dxa"/>
-              <w:bottom w:w="60.0" w:type="dxa"/>
-            </w:tcMar>
-            <w:vAlign w:val="center"/>
-          </w:tcPr>
-          <w:p>
-            <w:pPr>
-              <w:jc w:val="center"/>
-              <w:rPr>
-                <w:sz w:val="24"/>
-                <w:szCs w:val="24"/>
-              </w:rPr>
-            </w:pPr>
-            <w:r>
-              <w:rPr>
-                <w:b w:val="1"/>
-                <w:bCs w:val="1"/>
-                <w:sz w:val="24"/>
-                <w:szCs w:val="24"/>
-                <w:rtl w:val="1"/>
-              </w:rPr>
-              <w:t xml:space="preserve">ب</w:t>
+            <w:shd w:val="clear" w:color="auto" w:fill="F4CCCC"/>
+            <w:tcMar>
+              <w:top w:w="60.0" w:type="dxa"/>
+              <w:bottom w:w="60.0" w:type="dxa"/>
+            </w:tcMar>
+            <w:vAlign w:val="center"/>
+          </w:tcPr>
+          <w:p>
+            <w:pPr>
+              <w:jc w:val="center"/>
+              <w:rPr>
+                <w:sz w:val="24"/>
+                <w:szCs w:val="24"/>
+              </w:rPr>
+            </w:pPr>
+            <w:r>
+              <w:rPr>
+                <w:b w:val="1"/>
+                <w:bCs w:val="1"/>
+                <w:sz w:val="24"/>
+                <w:szCs w:val="24"/>
+                <w:rtl w:val="1"/>
+              </w:rPr>
+              <w:t xml:space="preserve">ج</w:t>
+            </w:r>
+          </w:p>
+        </w:tc>
+        <w:tc>
+          <w:tcPr>
+            <w:tcBorders>
+              <w:top w:color="808080" w:space="0" w:sz="4" w:val="single"/>
+              <w:left w:color="808080" w:space="0" w:sz="4" w:val="single"/>
+              <w:bottom w:color="808080" w:space="0" w:sz="4" w:val="single"/>
+              <w:right w:color="808080" w:space="0" w:sz="4" w:val="single"/>
+            </w:tcBorders>
+            <w:shd w:val="clear" w:color="auto" w:fill="D9EAD3"/>
+            <w:tcMar>
+              <w:top w:w="60.0" w:type="dxa"/>
+              <w:bottom w:w="60.0" w:type="dxa"/>
+            </w:tcMar>
+            <w:vAlign w:val="center"/>
+          </w:tcPr>
+          <w:p>
+            <w:pPr>
+              <w:jc w:val="center"/>
+              <w:rPr>
+                <w:sz w:val="24"/>
+                <w:szCs w:val="24"/>
+              </w:rPr>
+            </w:pPr>
+            <w:r>
+              <w:rPr>
+                <w:b w:val="1"/>
+                <w:bCs w:val="1"/>
+                <w:sz w:val="24"/>
+                <w:szCs w:val="24"/>
+                <w:rtl w:val="1"/>
+              </w:rPr>
+              <w:t xml:space="preserve">أ</w:t>
             </w:r>
           </w:p>
         </w:tc>
@@ -2570,6 +2570,41 @@
               <w:bottom w:color="808080" w:space="0" w:sz="4" w:val="single"/>
               <w:right w:color="808080" w:space="0" w:sz="4" w:val="single"/>
             </w:tcBorders>
+            <w:shd w:val="clear" w:color="auto" w:fill="FFF2CC"/>
+            <w:tcMar>
+              <w:top w:w="60.0" w:type="dxa"/>
+              <w:bottom w:w="60.0" w:type="dxa"/>
+            </w:tcMar>
+            <w:vAlign w:val="center"/>
+          </w:tcPr>
+          <w:p>
+            <w:pPr>
+              <w:jc w:val="center"/>
+              <w:rPr>
+                <w:sz w:val="24"/>
+                <w:szCs w:val="24"/>
+              </w:rPr>
+            </w:pPr>
+            <w:r>
+              <w:rPr>
+                <w:b w:val="1"/>
+                <w:bCs w:val="1"/>
+                <w:sz w:val="24"/>
+                <w:szCs w:val="24"/>
+                <w:rtl w:val="1"/>
+              </w:rPr>
+              <w:t xml:space="preserve">ب</w:t>
+            </w:r>
+          </w:p>
+        </w:tc>
+        <w:tc>
+          <w:tcPr>
+            <w:tcBorders>
+              <w:top w:color="808080" w:space="0" w:sz="4" w:val="single"/>
+              <w:left w:color="808080" w:space="0" w:sz="4" w:val="single"/>
+              <w:bottom w:color="808080" w:space="0" w:sz="4" w:val="single"/>
+              <w:right w:color="808080" w:space="0" w:sz="4" w:val="single"/>
+            </w:tcBorders>
             <w:shd w:val="clear" w:color="auto" w:fill="D9EAD3"/>
             <w:tcMar>
               <w:top w:w="60.0" w:type="dxa"/>
@@ -2605,64 +2640,29 @@
               <w:bottom w:color="808080" w:space="0" w:sz="4" w:val="single"/>
               <w:right w:color="808080" w:space="0" w:sz="4" w:val="single"/>
             </w:tcBorders>
-            <w:shd w:val="clear" w:color="auto" w:fill="D9EAD3"/>
-            <w:tcMar>
-              <w:top w:w="60.0" w:type="dxa"/>
-              <w:bottom w:w="60.0" w:type="dxa"/>
-            </w:tcMar>
-            <w:vAlign w:val="center"/>
-          </w:tcPr>
-          <w:p>
-            <w:pPr>
-              <w:jc w:val="center"/>
-              <w:rPr>
-                <w:sz w:val="24"/>
-                <w:szCs w:val="24"/>
-              </w:rPr>
-            </w:pPr>
-            <w:r>
-              <w:rPr>
-                <w:b w:val="1"/>
-                <w:bCs w:val="1"/>
-                <w:sz w:val="24"/>
-                <w:szCs w:val="24"/>
-                <w:rtl w:val="1"/>
-              </w:rPr>
-              <w:t xml:space="preserve">أ</w:t>
-            </w:r>
-          </w:p>
-        </w:tc>
-        <w:tc>
-          <w:tcPr>
-            <w:tcBorders>
-              <w:top w:color="808080" w:space="0" w:sz="4" w:val="single"/>
-              <w:left w:color="808080" w:space="0" w:sz="4" w:val="single"/>
-              <w:bottom w:color="808080" w:space="0" w:sz="4" w:val="single"/>
-              <w:right w:color="808080" w:space="0" w:sz="4" w:val="single"/>
-            </w:tcBorders>
-            <w:tcMar>
-              <w:top w:w="60.0" w:type="dxa"/>
-              <w:bottom w:w="60.0" w:type="dxa"/>
-            </w:tcMar>
-            <w:vAlign w:val="center"/>
-          </w:tcPr>
-          <w:p>
-            <w:pPr>
-              <w:jc w:val="center"/>
-              <w:rPr>
-                <w:sz w:val="24"/>
-                <w:szCs w:val="24"/>
-              </w:rPr>
-            </w:pPr>
-            <w:r>
-              <w:rPr>
-                <w:b w:val="1"/>
-                <w:bCs w:val="1"/>
-                <w:sz w:val="24"/>
-                <w:szCs w:val="24"/>
-                <w:rtl w:val="1"/>
-              </w:rPr>
-              <w:t xml:space="preserve">20</w:t>
+            <w:tcMar>
+              <w:top w:w="60.0" w:type="dxa"/>
+              <w:bottom w:w="60.0" w:type="dxa"/>
+            </w:tcMar>
+            <w:vAlign w:val="center"/>
+          </w:tcPr>
+          <w:p>
+            <w:pPr>
+              <w:jc w:val="center"/>
+              <w:rPr>
+                <w:sz w:val="24"/>
+                <w:szCs w:val="24"/>
+              </w:rPr>
+            </w:pPr>
+            <w:r>
+              <w:rPr>
+                <w:b w:val="1"/>
+                <w:bCs w:val="1"/>
+                <w:sz w:val="24"/>
+                <w:szCs w:val="24"/>
+                <w:rtl w:val="1"/>
+              </w:rPr>
+              <w:t xml:space="preserve">17</w:t>
             </w:r>
           </w:p>
         </w:tc>
@@ -2854,64 +2854,64 @@
               <w:bottom w:color="808080" w:space="0" w:sz="4" w:val="single"/>
               <w:right w:color="808080" w:space="0" w:sz="4" w:val="single"/>
             </w:tcBorders>
-            <w:shd w:val="clear" w:color="auto" w:fill="D9EAD3"/>
-            <w:tcMar>
-              <w:top w:w="60.0" w:type="dxa"/>
-              <w:bottom w:w="60.0" w:type="dxa"/>
-            </w:tcMar>
-            <w:vAlign w:val="center"/>
-          </w:tcPr>
-          <w:p>
-            <w:pPr>
-              <w:jc w:val="center"/>
-              <w:rPr>
-                <w:sz w:val="24"/>
-                <w:szCs w:val="24"/>
-              </w:rPr>
-            </w:pPr>
-            <w:r>
-              <w:rPr>
-                <w:b w:val="1"/>
-                <w:bCs w:val="1"/>
-                <w:sz w:val="24"/>
-                <w:szCs w:val="24"/>
-                <w:rtl w:val="1"/>
-              </w:rPr>
-              <w:t xml:space="preserve">أ</w:t>
-            </w:r>
-          </w:p>
-        </w:tc>
-        <w:tc>
-          <w:tcPr>
-            <w:tcBorders>
-              <w:top w:color="808080" w:space="0" w:sz="4" w:val="single"/>
-              <w:left w:color="808080" w:space="0" w:sz="4" w:val="single"/>
-              <w:bottom w:color="808080" w:space="0" w:sz="4" w:val="single"/>
-              <w:right w:color="808080" w:space="0" w:sz="4" w:val="single"/>
-            </w:tcBorders>
-            <w:tcMar>
-              <w:top w:w="60.0" w:type="dxa"/>
-              <w:bottom w:w="60.0" w:type="dxa"/>
-            </w:tcMar>
-            <w:vAlign w:val="center"/>
-          </w:tcPr>
-          <w:p>
-            <w:pPr>
-              <w:jc w:val="center"/>
-              <w:rPr>
-                <w:sz w:val="24"/>
-                <w:szCs w:val="24"/>
-              </w:rPr>
-            </w:pPr>
-            <w:r>
-              <w:rPr>
-                <w:b w:val="1"/>
-                <w:bCs w:val="1"/>
-                <w:sz w:val="24"/>
-                <w:szCs w:val="24"/>
-                <w:rtl w:val="1"/>
-              </w:rPr>
-              <w:t xml:space="preserve">16</w:t>
+            <w:shd w:val="clear" w:color="auto" w:fill="FFF2CC"/>
+            <w:tcMar>
+              <w:top w:w="60.0" w:type="dxa"/>
+              <w:bottom w:w="60.0" w:type="dxa"/>
+            </w:tcMar>
+            <w:vAlign w:val="center"/>
+          </w:tcPr>
+          <w:p>
+            <w:pPr>
+              <w:jc w:val="center"/>
+              <w:rPr>
+                <w:sz w:val="24"/>
+                <w:szCs w:val="24"/>
+              </w:rPr>
+            </w:pPr>
+            <w:r>
+              <w:rPr>
+                <w:b w:val="1"/>
+                <w:bCs w:val="1"/>
+                <w:sz w:val="24"/>
+                <w:szCs w:val="24"/>
+                <w:rtl w:val="1"/>
+              </w:rPr>
+              <w:t xml:space="preserve">ب</w:t>
+            </w:r>
+          </w:p>
+        </w:tc>
+        <w:tc>
+          <w:tcPr>
+            <w:tcBorders>
+              <w:top w:color="808080" w:space="0" w:sz="4" w:val="single"/>
+              <w:left w:color="808080" w:space="0" w:sz="4" w:val="single"/>
+              <w:bottom w:color="808080" w:space="0" w:sz="4" w:val="single"/>
+              <w:right w:color="808080" w:space="0" w:sz="4" w:val="single"/>
+            </w:tcBorders>
+            <w:tcMar>
+              <w:top w:w="60.0" w:type="dxa"/>
+              <w:bottom w:w="60.0" w:type="dxa"/>
+            </w:tcMar>
+            <w:vAlign w:val="center"/>
+          </w:tcPr>
+          <w:p>
+            <w:pPr>
+              <w:jc w:val="center"/>
+              <w:rPr>
+                <w:sz w:val="24"/>
+                <w:szCs w:val="24"/>
+              </w:rPr>
+            </w:pPr>
+            <w:r>
+              <w:rPr>
+                <w:b w:val="1"/>
+                <w:bCs w:val="1"/>
+                <w:sz w:val="24"/>
+                <w:szCs w:val="24"/>
+                <w:rtl w:val="1"/>
+              </w:rPr>
+              <w:t xml:space="preserve">14</w:t>
             </w:r>
           </w:p>
         </w:tc>
@@ -3033,65 +3033,65 @@
               <w:bottom w:color="808080" w:space="0" w:sz="4" w:val="single"/>
               <w:right w:color="808080" w:space="0" w:sz="4" w:val="single"/>
             </w:tcBorders>
-            <w:shd w:val="clear" w:color="auto" w:fill="FFF2CC"/>
-            <w:tcMar>
-              <w:top w:w="60.0" w:type="dxa"/>
-              <w:bottom w:w="60.0" w:type="dxa"/>
-            </w:tcMar>
-            <w:vAlign w:val="center"/>
-          </w:tcPr>
-          <w:p>
-            <w:pPr>
-              <w:jc w:val="center"/>
-              <w:rPr>
-                <w:sz w:val="24"/>
-                <w:szCs w:val="24"/>
-              </w:rPr>
-            </w:pPr>
-            <w:r>
-              <w:rPr>
-                <w:b w:val="1"/>
-                <w:bCs w:val="1"/>
-                <w:sz w:val="24"/>
-                <w:szCs w:val="24"/>
-                <w:rtl w:val="1"/>
-              </w:rPr>
-              <w:t xml:space="preserve">ب</w:t>
-            </w:r>
-          </w:p>
-        </w:tc>
-        <w:tc>
-          <w:tcPr>
-            <w:tcBorders>
-              <w:top w:color="808080" w:space="0" w:sz="4" w:val="single"/>
-              <w:left w:color="808080" w:space="0" w:sz="4" w:val="single"/>
-              <w:bottom w:color="808080" w:space="0" w:sz="4" w:val="single"/>
-              <w:right w:color="808080" w:space="0" w:sz="4" w:val="single"/>
-            </w:tcBorders>
-            <w:shd w:val="clear" w:color="auto" w:fill="FFF2CC"/>
-            <w:tcMar>
-              <w:top w:w="60.0" w:type="dxa"/>
-              <w:bottom w:w="60.0" w:type="dxa"/>
-            </w:tcMar>
-            <w:vAlign w:val="center"/>
-          </w:tcPr>
-          <w:p>
-            <w:pPr>
-              <w:jc w:val="center"/>
-              <w:rPr>
-                <w:sz w:val="24"/>
-                <w:szCs w:val="24"/>
-              </w:rPr>
-            </w:pPr>
-            <w:r>
-              <w:rPr>
-                <w:b w:val="1"/>
-                <w:bCs w:val="1"/>
-                <w:sz w:val="24"/>
-                <w:szCs w:val="24"/>
-                <w:rtl w:val="1"/>
-              </w:rPr>
-              <w:t xml:space="preserve">ب</w:t>
+            <w:shd w:val="clear" w:color="auto" w:fill="D9EAD3"/>
+            <w:tcMar>
+              <w:top w:w="60.0" w:type="dxa"/>
+              <w:bottom w:w="60.0" w:type="dxa"/>
+            </w:tcMar>
+            <w:vAlign w:val="center"/>
+          </w:tcPr>
+          <w:p>
+            <w:pPr>
+              <w:jc w:val="center"/>
+              <w:rPr>
+                <w:sz w:val="24"/>
+                <w:szCs w:val="24"/>
+              </w:rPr>
+            </w:pPr>
+            <w:r>
+              <w:rPr>
+                <w:b w:val="1"/>
+                <w:bCs w:val="1"/>
+                <w:sz w:val="24"/>
+                <w:szCs w:val="24"/>
+                <w:rtl w:val="1"/>
+              </w:rPr>
+              <w:t xml:space="preserve">أ</w:t>
+            </w:r>
+          </w:p>
+        </w:tc>
+        <w:tc>
+          <w:tcPr>
+            <w:tcBorders>
+              <w:top w:color="808080" w:space="0" w:sz="4" w:val="single"/>
+              <w:left w:color="808080" w:space="0" w:sz="4" w:val="single"/>
+              <w:bottom w:color="808080" w:space="0" w:sz="4" w:val="single"/>
+              <w:right w:color="808080" w:space="0" w:sz="4" w:val="single"/>
+            </w:tcBorders>
+            <w:shd w:val="clear" w:color="auto" w:fill="F4CCCC"/>
+            <w:tcMar>
+              <w:top w:w="60.0" w:type="dxa"/>
+              <w:bottom w:w="60.0" w:type="dxa"/>
+            </w:tcMar>
+            <w:vAlign w:val="center"/>
+          </w:tcPr>
+          <w:p>
+            <w:pPr>
+              <w:jc w:val="center"/>
+              <w:rPr>
+                <w:sz w:val="24"/>
+                <w:szCs w:val="24"/>
+              </w:rPr>
+            </w:pPr>
+            <w:r>
+              <w:rPr>
+                <w:b w:val="1"/>
+                <w:bCs w:val="1"/>
+                <w:sz w:val="24"/>
+                <w:szCs w:val="24"/>
+                <w:rtl w:val="1"/>
+              </w:rPr>
+              <w:t xml:space="preserve">ج</w:t>
             </w:r>
           </w:p>
         </w:tc>
@@ -3247,65 +3247,65 @@
               <w:bottom w:color="808080" w:space="0" w:sz="4" w:val="single"/>
               <w:right w:color="808080" w:space="0" w:sz="4" w:val="single"/>
             </w:tcBorders>
-            <w:shd w:val="clear" w:color="auto" w:fill="FFF2CC"/>
-            <w:tcMar>
-              <w:top w:w="60.0" w:type="dxa"/>
-              <w:bottom w:w="60.0" w:type="dxa"/>
-            </w:tcMar>
-            <w:vAlign w:val="center"/>
-          </w:tcPr>
-          <w:p>
-            <w:pPr>
-              <w:jc w:val="center"/>
-              <w:rPr>
-                <w:sz w:val="24"/>
-                <w:szCs w:val="24"/>
-              </w:rPr>
-            </w:pPr>
-            <w:r>
-              <w:rPr>
-                <w:b w:val="1"/>
-                <w:bCs w:val="1"/>
-                <w:sz w:val="24"/>
-                <w:szCs w:val="24"/>
-                <w:rtl w:val="1"/>
-              </w:rPr>
-              <w:t xml:space="preserve">ب</w:t>
-            </w:r>
-          </w:p>
-        </w:tc>
-        <w:tc>
-          <w:tcPr>
-            <w:tcBorders>
-              <w:top w:color="808080" w:space="0" w:sz="4" w:val="single"/>
-              <w:left w:color="808080" w:space="0" w:sz="4" w:val="single"/>
-              <w:bottom w:color="808080" w:space="0" w:sz="4" w:val="single"/>
-              <w:right w:color="808080" w:space="0" w:sz="4" w:val="single"/>
-            </w:tcBorders>
-            <w:shd w:val="clear" w:color="auto" w:fill="FFF2CC"/>
-            <w:tcMar>
-              <w:top w:w="60.0" w:type="dxa"/>
-              <w:bottom w:w="60.0" w:type="dxa"/>
-            </w:tcMar>
-            <w:vAlign w:val="center"/>
-          </w:tcPr>
-          <w:p>
-            <w:pPr>
-              <w:jc w:val="center"/>
-              <w:rPr>
-                <w:sz w:val="24"/>
-                <w:szCs w:val="24"/>
-              </w:rPr>
-            </w:pPr>
-            <w:r>
-              <w:rPr>
-                <w:b w:val="1"/>
-                <w:bCs w:val="1"/>
-                <w:sz w:val="24"/>
-                <w:szCs w:val="24"/>
-                <w:rtl w:val="1"/>
-              </w:rPr>
-              <w:t xml:space="preserve">ب</w:t>
+            <w:shd w:val="clear" w:color="auto" w:fill="F4CCCC"/>
+            <w:tcMar>
+              <w:top w:w="60.0" w:type="dxa"/>
+              <w:bottom w:w="60.0" w:type="dxa"/>
+            </w:tcMar>
+            <w:vAlign w:val="center"/>
+          </w:tcPr>
+          <w:p>
+            <w:pPr>
+              <w:jc w:val="center"/>
+              <w:rPr>
+                <w:sz w:val="24"/>
+                <w:szCs w:val="24"/>
+              </w:rPr>
+            </w:pPr>
+            <w:r>
+              <w:rPr>
+                <w:b w:val="1"/>
+                <w:bCs w:val="1"/>
+                <w:sz w:val="24"/>
+                <w:szCs w:val="24"/>
+                <w:rtl w:val="1"/>
+              </w:rPr>
+              <w:t xml:space="preserve">ج</w:t>
+            </w:r>
+          </w:p>
+        </w:tc>
+        <w:tc>
+          <w:tcPr>
+            <w:tcBorders>
+              <w:top w:color="808080" w:space="0" w:sz="4" w:val="single"/>
+              <w:left w:color="808080" w:space="0" w:sz="4" w:val="single"/>
+              <w:bottom w:color="808080" w:space="0" w:sz="4" w:val="single"/>
+              <w:right w:color="808080" w:space="0" w:sz="4" w:val="single"/>
+            </w:tcBorders>
+            <w:shd w:val="clear" w:color="auto" w:fill="D9EAD3"/>
+            <w:tcMar>
+              <w:top w:w="60.0" w:type="dxa"/>
+              <w:bottom w:w="60.0" w:type="dxa"/>
+            </w:tcMar>
+            <w:vAlign w:val="center"/>
+          </w:tcPr>
+          <w:p>
+            <w:pPr>
+              <w:jc w:val="center"/>
+              <w:rPr>
+                <w:sz w:val="24"/>
+                <w:szCs w:val="24"/>
+              </w:rPr>
+            </w:pPr>
+            <w:r>
+              <w:rPr>
+                <w:b w:val="1"/>
+                <w:bCs w:val="1"/>
+                <w:sz w:val="24"/>
+                <w:szCs w:val="24"/>
+                <w:rtl w:val="1"/>
+              </w:rPr>
+              <w:t xml:space="preserve">أ</w:t>
             </w:r>
           </w:p>
         </w:tc>
@@ -3461,6 +3461,111 @@
               <w:bottom w:color="808080" w:space="0" w:sz="4" w:val="single"/>
               <w:right w:color="808080" w:space="0" w:sz="4" w:val="single"/>
             </w:tcBorders>
+            <w:shd w:val="clear" w:color="auto" w:fill="D9EAD3"/>
+            <w:tcMar>
+              <w:top w:w="60.0" w:type="dxa"/>
+              <w:bottom w:w="60.0" w:type="dxa"/>
+            </w:tcMar>
+            <w:vAlign w:val="center"/>
+          </w:tcPr>
+          <w:p>
+            <w:pPr>
+              <w:jc w:val="center"/>
+              <w:rPr>
+                <w:sz w:val="24"/>
+                <w:szCs w:val="24"/>
+              </w:rPr>
+            </w:pPr>
+            <w:r>
+              <w:rPr>
+                <w:b w:val="1"/>
+                <w:bCs w:val="1"/>
+                <w:sz w:val="24"/>
+                <w:szCs w:val="24"/>
+                <w:rtl w:val="1"/>
+              </w:rPr>
+              <w:t xml:space="preserve">أ</w:t>
+            </w:r>
+          </w:p>
+        </w:tc>
+        <w:tc>
+          <w:tcPr>
+            <w:tcBorders>
+              <w:top w:color="808080" w:space="0" w:sz="4" w:val="single"/>
+              <w:left w:color="808080" w:space="0" w:sz="4" w:val="single"/>
+              <w:bottom w:color="808080" w:space="0" w:sz="4" w:val="single"/>
+              <w:right w:color="808080" w:space="0" w:sz="4" w:val="single"/>
+            </w:tcBorders>
+            <w:shd w:val="clear" w:color="auto" w:fill="D9EAD3"/>
+            <w:tcMar>
+              <w:top w:w="60.0" w:type="dxa"/>
+              <w:bottom w:w="60.0" w:type="dxa"/>
+            </w:tcMar>
+            <w:vAlign w:val="center"/>
+          </w:tcPr>
+          <w:p>
+            <w:pPr>
+              <w:jc w:val="center"/>
+              <w:rPr>
+                <w:sz w:val="24"/>
+                <w:szCs w:val="24"/>
+              </w:rPr>
+            </w:pPr>
+            <w:r>
+              <w:rPr>
+                <w:b w:val="1"/>
+                <w:bCs w:val="1"/>
+                <w:sz w:val="24"/>
+                <w:szCs w:val="24"/>
+                <w:rtl w:val="1"/>
+              </w:rPr>
+              <w:t xml:space="preserve">أ</w:t>
+            </w:r>
+          </w:p>
+        </w:tc>
+        <w:tc>
+          <w:tcPr>
+            <w:tcBorders>
+              <w:top w:color="808080" w:space="0" w:sz="4" w:val="single"/>
+              <w:left w:color="808080" w:space="0" w:sz="4" w:val="single"/>
+              <w:bottom w:color="808080" w:space="0" w:sz="4" w:val="single"/>
+              <w:right w:color="808080" w:space="0" w:sz="4" w:val="single"/>
+            </w:tcBorders>
+            <w:shd w:val="clear" w:color="auto" w:fill="D9EAD3"/>
+            <w:tcMar>
+              <w:top w:w="60.0" w:type="dxa"/>
+              <w:bottom w:w="60.0" w:type="dxa"/>
+            </w:tcMar>
+            <w:vAlign w:val="center"/>
+          </w:tcPr>
+          <w:p>
+            <w:pPr>
+              <w:jc w:val="center"/>
+              <w:rPr>
+                <w:sz w:val="24"/>
+                <w:szCs w:val="24"/>
+              </w:rPr>
+            </w:pPr>
+            <w:r>
+              <w:rPr>
+                <w:b w:val="1"/>
+                <w:bCs w:val="1"/>
+                <w:sz w:val="24"/>
+                <w:szCs w:val="24"/>
+                <w:rtl w:val="1"/>
+              </w:rPr>
+              <w:t xml:space="preserve">أ</w:t>
+            </w:r>
+          </w:p>
+        </w:tc>
+        <w:tc>
+          <w:tcPr>
+            <w:tcBorders>
+              <w:top w:color="808080" w:space="0" w:sz="4" w:val="single"/>
+              <w:left w:color="808080" w:space="0" w:sz="4" w:val="single"/>
+              <w:bottom w:color="808080" w:space="0" w:sz="4" w:val="single"/>
+              <w:right w:color="808080" w:space="0" w:sz="4" w:val="single"/>
+            </w:tcBorders>
             <w:shd w:val="clear" w:color="auto" w:fill="FFF2CC"/>
             <w:tcMar>
               <w:top w:w="60.0" w:type="dxa"/>
@@ -3496,41 +3601,6 @@
               <w:bottom w:color="808080" w:space="0" w:sz="4" w:val="single"/>
               <w:right w:color="808080" w:space="0" w:sz="4" w:val="single"/>
             </w:tcBorders>
-            <w:shd w:val="clear" w:color="auto" w:fill="FFF2CC"/>
-            <w:tcMar>
-              <w:top w:w="60.0" w:type="dxa"/>
-              <w:bottom w:w="60.0" w:type="dxa"/>
-            </w:tcMar>
-            <w:vAlign w:val="center"/>
-          </w:tcPr>
-          <w:p>
-            <w:pPr>
-              <w:jc w:val="center"/>
-              <w:rPr>
-                <w:sz w:val="24"/>
-                <w:szCs w:val="24"/>
-              </w:rPr>
-            </w:pPr>
-            <w:r>
-              <w:rPr>
-                <w:b w:val="1"/>
-                <w:bCs w:val="1"/>
-                <w:sz w:val="24"/>
-                <w:szCs w:val="24"/>
-                <w:rtl w:val="1"/>
-              </w:rPr>
-              <w:t xml:space="preserve">ب</w:t>
-            </w:r>
-          </w:p>
-        </w:tc>
-        <w:tc>
-          <w:tcPr>
-            <w:tcBorders>
-              <w:top w:color="808080" w:space="0" w:sz="4" w:val="single"/>
-              <w:left w:color="808080" w:space="0" w:sz="4" w:val="single"/>
-              <w:bottom w:color="808080" w:space="0" w:sz="4" w:val="single"/>
-              <w:right w:color="808080" w:space="0" w:sz="4" w:val="single"/>
-            </w:tcBorders>
             <w:shd w:val="clear" w:color="auto" w:fill="D9EAD3"/>
             <w:tcMar>
               <w:top w:w="60.0" w:type="dxa"/>
@@ -3566,99 +3636,29 @@
               <w:bottom w:color="808080" w:space="0" w:sz="4" w:val="single"/>
               <w:right w:color="808080" w:space="0" w:sz="4" w:val="single"/>
             </w:tcBorders>
-            <w:shd w:val="clear" w:color="auto" w:fill="FFF2CC"/>
-            <w:tcMar>
-              <w:top w:w="60.0" w:type="dxa"/>
-              <w:bottom w:w="60.0" w:type="dxa"/>
-            </w:tcMar>
-            <w:vAlign w:val="center"/>
-          </w:tcPr>
-          <w:p>
-            <w:pPr>
-              <w:jc w:val="center"/>
-              <w:rPr>
-                <w:sz w:val="24"/>
-                <w:szCs w:val="24"/>
-              </w:rPr>
-            </w:pPr>
-            <w:r>
-              <w:rPr>
-                <w:b w:val="1"/>
-                <w:bCs w:val="1"/>
-                <w:sz w:val="24"/>
-                <w:szCs w:val="24"/>
-                <w:rtl w:val="1"/>
-              </w:rPr>
-              <w:t xml:space="preserve">ب</w:t>
-            </w:r>
-          </w:p>
-        </w:tc>
-        <w:tc>
-          <w:tcPr>
-            <w:tcBorders>
-              <w:top w:color="808080" w:space="0" w:sz="4" w:val="single"/>
-              <w:left w:color="808080" w:space="0" w:sz="4" w:val="single"/>
-              <w:bottom w:color="808080" w:space="0" w:sz="4" w:val="single"/>
-              <w:right w:color="808080" w:space="0" w:sz="4" w:val="single"/>
-            </w:tcBorders>
-            <w:shd w:val="clear" w:color="auto" w:fill="FFF2CC"/>
-            <w:tcMar>
-              <w:top w:w="60.0" w:type="dxa"/>
-              <w:bottom w:w="60.0" w:type="dxa"/>
-            </w:tcMar>
-            <w:vAlign w:val="center"/>
-          </w:tcPr>
-          <w:p>
-            <w:pPr>
-              <w:jc w:val="center"/>
-              <w:rPr>
-                <w:sz w:val="24"/>
-                <w:szCs w:val="24"/>
-              </w:rPr>
-            </w:pPr>
-            <w:r>
-              <w:rPr>
-                <w:b w:val="1"/>
-                <w:bCs w:val="1"/>
-                <w:sz w:val="24"/>
-                <w:szCs w:val="24"/>
-                <w:rtl w:val="1"/>
-              </w:rPr>
-              <w:t xml:space="preserve">ب</w:t>
-            </w:r>
-          </w:p>
-        </w:tc>
-        <w:tc>
-          <w:tcPr>
-            <w:tcBorders>
-              <w:top w:color="808080" w:space="0" w:sz="4" w:val="single"/>
-              <w:left w:color="808080" w:space="0" w:sz="4" w:val="single"/>
-              <w:bottom w:color="808080" w:space="0" w:sz="4" w:val="single"/>
-              <w:right w:color="808080" w:space="0" w:sz="4" w:val="single"/>
-            </w:tcBorders>
-            <w:tcMar>
-              <w:top w:w="60.0" w:type="dxa"/>
-              <w:bottom w:w="60.0" w:type="dxa"/>
-            </w:tcMar>
-            <w:vAlign w:val="center"/>
-          </w:tcPr>
-          <w:p>
-            <w:pPr>
-              <w:jc w:val="center"/>
-              <w:rPr>
-                <w:sz w:val="24"/>
-                <w:szCs w:val="24"/>
-              </w:rPr>
-            </w:pPr>
-            <w:r>
-              <w:rPr>
-                <w:b w:val="1"/>
-                <w:bCs w:val="1"/>
-                <w:sz w:val="24"/>
-                <w:szCs w:val="24"/>
-                <w:rtl w:val="1"/>
-              </w:rPr>
-              <w:t xml:space="preserve">12</w:t>
+            <w:tcMar>
+              <w:top w:w="60.0" w:type="dxa"/>
+              <w:bottom w:w="60.0" w:type="dxa"/>
+            </w:tcMar>
+            <w:vAlign w:val="center"/>
+          </w:tcPr>
+          <w:p>
+            <w:pPr>
+              <w:jc w:val="center"/>
+              <w:rPr>
+                <w:sz w:val="24"/>
+                <w:szCs w:val="24"/>
+              </w:rPr>
+            </w:pPr>
+            <w:r>
+              <w:rPr>
+                <w:b w:val="1"/>
+                <w:bCs w:val="1"/>
+                <w:sz w:val="24"/>
+                <w:szCs w:val="24"/>
+                <w:rtl w:val="1"/>
+              </w:rPr>
+              <w:t xml:space="preserve">18</w:t>
             </w:r>
           </w:p>
         </w:tc>
@@ -3750,6 +3750,76 @@
               <w:bottom w:color="808080" w:space="0" w:sz="4" w:val="single"/>
               <w:right w:color="808080" w:space="0" w:sz="4" w:val="single"/>
             </w:tcBorders>
+            <w:shd w:val="clear" w:color="auto" w:fill="D9EAD3"/>
+            <w:tcMar>
+              <w:top w:w="60.0" w:type="dxa"/>
+              <w:bottom w:w="60.0" w:type="dxa"/>
+            </w:tcMar>
+            <w:vAlign w:val="center"/>
+          </w:tcPr>
+          <w:p>
+            <w:pPr>
+              <w:jc w:val="center"/>
+              <w:rPr>
+                <w:sz w:val="24"/>
+                <w:szCs w:val="24"/>
+              </w:rPr>
+            </w:pPr>
+            <w:r>
+              <w:rPr>
+                <w:b w:val="1"/>
+                <w:bCs w:val="1"/>
+                <w:sz w:val="24"/>
+                <w:szCs w:val="24"/>
+                <w:rtl w:val="1"/>
+              </w:rPr>
+              <w:t xml:space="preserve">أ</w:t>
+            </w:r>
+          </w:p>
+        </w:tc>
+        <w:tc>
+          <w:tcPr>
+            <w:tcBorders>
+              <w:top w:color="808080" w:space="0" w:sz="4" w:val="single"/>
+              <w:left w:color="808080" w:space="0" w:sz="4" w:val="single"/>
+              <w:bottom w:color="808080" w:space="0" w:sz="4" w:val="single"/>
+              <w:right w:color="808080" w:space="0" w:sz="4" w:val="single"/>
+            </w:tcBorders>
+            <w:shd w:val="clear" w:color="auto" w:fill="D9EAD3"/>
+            <w:tcMar>
+              <w:top w:w="60.0" w:type="dxa"/>
+              <w:bottom w:w="60.0" w:type="dxa"/>
+            </w:tcMar>
+            <w:vAlign w:val="center"/>
+          </w:tcPr>
+          <w:p>
+            <w:pPr>
+              <w:jc w:val="center"/>
+              <w:rPr>
+                <w:sz w:val="24"/>
+                <w:szCs w:val="24"/>
+              </w:rPr>
+            </w:pPr>
+            <w:r>
+              <w:rPr>
+                <w:b w:val="1"/>
+                <w:bCs w:val="1"/>
+                <w:sz w:val="24"/>
+                <w:szCs w:val="24"/>
+                <w:rtl w:val="1"/>
+              </w:rPr>
+              <w:t xml:space="preserve">أ</w:t>
+            </w:r>
+          </w:p>
+        </w:tc>
+        <w:tc>
+          <w:tcPr>
+            <w:tcBorders>
+              <w:top w:color="808080" w:space="0" w:sz="4" w:val="single"/>
+              <w:left w:color="808080" w:space="0" w:sz="4" w:val="single"/>
+              <w:bottom w:color="808080" w:space="0" w:sz="4" w:val="single"/>
+              <w:right w:color="808080" w:space="0" w:sz="4" w:val="single"/>
+            </w:tcBorders>
             <w:shd w:val="clear" w:color="auto" w:fill="FFF2CC"/>
             <w:tcMar>
               <w:top w:w="60.0" w:type="dxa"/>
@@ -3820,99 +3890,29 @@
               <w:bottom w:color="808080" w:space="0" w:sz="4" w:val="single"/>
               <w:right w:color="808080" w:space="0" w:sz="4" w:val="single"/>
             </w:tcBorders>
-            <w:shd w:val="clear" w:color="auto" w:fill="FFF2CC"/>
-            <w:tcMar>
-              <w:top w:w="60.0" w:type="dxa"/>
-              <w:bottom w:w="60.0" w:type="dxa"/>
-            </w:tcMar>
-            <w:vAlign w:val="center"/>
-          </w:tcPr>
-          <w:p>
-            <w:pPr>
-              <w:jc w:val="center"/>
-              <w:rPr>
-                <w:sz w:val="24"/>
-                <w:szCs w:val="24"/>
-              </w:rPr>
-            </w:pPr>
-            <w:r>
-              <w:rPr>
-                <w:b w:val="1"/>
-                <w:bCs w:val="1"/>
-                <w:sz w:val="24"/>
-                <w:szCs w:val="24"/>
-                <w:rtl w:val="1"/>
-              </w:rPr>
-              <w:t xml:space="preserve">ب</w:t>
-            </w:r>
-          </w:p>
-        </w:tc>
-        <w:tc>
-          <w:tcPr>
-            <w:tcBorders>
-              <w:top w:color="808080" w:space="0" w:sz="4" w:val="single"/>
-              <w:left w:color="808080" w:space="0" w:sz="4" w:val="single"/>
-              <w:bottom w:color="808080" w:space="0" w:sz="4" w:val="single"/>
-              <w:right w:color="808080" w:space="0" w:sz="4" w:val="single"/>
-            </w:tcBorders>
-            <w:shd w:val="clear" w:color="auto" w:fill="FFF2CC"/>
-            <w:tcMar>
-              <w:top w:w="60.0" w:type="dxa"/>
-              <w:bottom w:w="60.0" w:type="dxa"/>
-            </w:tcMar>
-            <w:vAlign w:val="center"/>
-          </w:tcPr>
-          <w:p>
-            <w:pPr>
-              <w:jc w:val="center"/>
-              <w:rPr>
-                <w:sz w:val="24"/>
-                <w:szCs w:val="24"/>
-              </w:rPr>
-            </w:pPr>
-            <w:r>
-              <w:rPr>
-                <w:b w:val="1"/>
-                <w:bCs w:val="1"/>
-                <w:sz w:val="24"/>
-                <w:szCs w:val="24"/>
-                <w:rtl w:val="1"/>
-              </w:rPr>
-              <w:t xml:space="preserve">ب</w:t>
-            </w:r>
-          </w:p>
-        </w:tc>
-        <w:tc>
-          <w:tcPr>
-            <w:tcBorders>
-              <w:top w:color="808080" w:space="0" w:sz="4" w:val="single"/>
-              <w:left w:color="808080" w:space="0" w:sz="4" w:val="single"/>
-              <w:bottom w:color="808080" w:space="0" w:sz="4" w:val="single"/>
-              <w:right w:color="808080" w:space="0" w:sz="4" w:val="single"/>
-            </w:tcBorders>
-            <w:tcMar>
-              <w:top w:w="60.0" w:type="dxa"/>
-              <w:bottom w:w="60.0" w:type="dxa"/>
-            </w:tcMar>
-            <w:vAlign w:val="center"/>
-          </w:tcPr>
-          <w:p>
-            <w:pPr>
-              <w:jc w:val="center"/>
-              <w:rPr>
-                <w:sz w:val="24"/>
-                <w:szCs w:val="24"/>
-              </w:rPr>
-            </w:pPr>
-            <w:r>
-              <w:rPr>
-                <w:b w:val="1"/>
-                <w:bCs w:val="1"/>
-                <w:sz w:val="24"/>
-                <w:szCs w:val="24"/>
-                <w:rtl w:val="1"/>
-              </w:rPr>
-              <w:t xml:space="preserve">15.38</w:t>
+            <w:tcMar>
+              <w:top w:w="60.0" w:type="dxa"/>
+              <w:bottom w:w="60.0" w:type="dxa"/>
+            </w:tcMar>
+            <w:vAlign w:val="center"/>
+          </w:tcPr>
+          <w:p>
+            <w:pPr>
+              <w:jc w:val="center"/>
+              <w:rPr>
+                <w:sz w:val="24"/>
+                <w:szCs w:val="24"/>
+              </w:rPr>
+            </w:pPr>
+            <w:r>
+              <w:rPr>
+                <w:b w:val="1"/>
+                <w:bCs w:val="1"/>
+                <w:sz w:val="24"/>
+                <w:szCs w:val="24"/>
+                <w:rtl w:val="1"/>
+              </w:rPr>
+              <w:t xml:space="preserve">15.50</w:t>
             </w:r>
           </w:p>
         </w:tc>
@@ -4046,7 +4046,7 @@
                 <w:szCs w:val="21"/>
                 <w:rtl w:val="0"/>
               </w:rPr>
-              <w:t xml:space="preserve"> 76.88/100</w:t>
+              <w:t xml:space="preserve"> 77.50/100</w:t>
             </w:r>
             <w:r>
               <w:rPr>
@@ -4470,7 +4470,7 @@
           <w:szCs w:val="24"/>
           <w:rtl w:val="1"/>
         </w:rPr>
-        <w:t xml:space="preserve">1 (اختيار الجواب الصحيح) و3 (التحليل إلى عوامل أولية، ق.م.أك وم.م.أص).</w:t>
+        <w:t xml:space="preserve">1 (اختيار الجواب الصحيح)، 3 (التحليل إلى عوامل أولية، ق.م.أك وم.م.أص)، 5 (المعادلات).</w:t>
       </w:r>
     </w:p>
     <w:p>
@@ -4492,7 +4492,7 @@
           <w:szCs w:val="24"/>
           <w:rtl w:val="1"/>
         </w:rPr>
-        <w:t xml:space="preserve">- أهداف متحققة جزئياً: </w:t>
+        <w:t xml:space="preserve">- هدف متحقق جزئياً: </w:t>
       </w:r>
       <w:r>
         <w:rPr>
@@ -4500,7 +4500,7 @@
           <w:szCs w:val="24"/>
           <w:rtl w:val="1"/>
         </w:rPr>
-        <w:t xml:space="preserve">2 (العمليات على الكسور) و5 (المعادلات من الدرجة الأولى).</w:t>
+        <w:t xml:space="preserve">2 (العمليات على الكسور) مع ظهور الفئة ج لدى تلميذ واحد.</w:t>
       </w:r>
     </w:p>
     <w:p>
@@ -4530,7 +4530,7 @@
           <w:szCs w:val="24"/>
           <w:rtl w:val="1"/>
         </w:rPr>
-        <w:t xml:space="preserve">4 (المتطابقات الشهيرة والقيمة العددية).</w:t>
+        <w:t xml:space="preserve">4 (المتطابقات الشهيرة والقيمة العددية): غالبية ب وفئتا ج.</w:t>
       </w:r>
     </w:p>
     <w:p>
@@ -4546,11 +4546,21 @@
       </w:pPr>
       <w:r>
         <w:rPr>
+          <w:b w:val="1"/>
+          <w:bCs w:val="1"/>
           <w:sz w:val="24"/>
           <w:szCs w:val="24"/>
           <w:rtl w:val="1"/>
         </w:rPr>
-        <w:t xml:space="preserve">لا توجد فئة ج في أي هدف.</w:t>
+        <w:t xml:space="preserve">- الفئة ج: </w:t>
+      </w:r>
+      <w:r>
+        <w:rPr>
+          <w:sz w:val="24"/>
+          <w:szCs w:val="24"/>
+          <w:rtl w:val="1"/>
+        </w:rPr>
+        <w:t xml:space="preserve">في الهدف 4 (بتول مطر، عباس عقيل) وفي الهدف 2 (علي حيدر).</w:t>
       </w:r>
     </w:p>
     <w:p>
@@ -4605,7 +4615,7 @@
           <w:szCs w:val="24"/>
           <w:rtl w:val="1"/>
         </w:rPr>
-        <w:t xml:space="preserve">حيدر الشيخ، مصطفى عواصة، هادي عيتاوي، حسين عواضة.</w:t>
+        <w:t xml:space="preserve">حيدر الشيخ، ريان عيتاني، مصطفى عواصة، حسين عواضة.</w:t>
       </w:r>
     </w:p>
     <w:p>
@@ -4627,7 +4637,7 @@
           <w:szCs w:val="24"/>
           <w:rtl w:val="1"/>
         </w:rPr>
-        <w:t xml:space="preserve">- مستوى متوسط بحاجة إلى دعم: </w:t>
+        <w:t xml:space="preserve">- بحاجة إلى دعم: </w:t>
       </w:r>
       <w:r>
         <w:rPr>
@@ -4635,7 +4645,7 @@
           <w:szCs w:val="24"/>
           <w:rtl w:val="1"/>
         </w:rPr>
-        <w:t xml:space="preserve">بتول مطر، علي حيدر، عباس عقيل، ريان عيتاني.</w:t>
+        <w:t xml:space="preserve">هادي عيتاوي، بتول مطر، علي حيدر، عباس عقيل (مع فئة ج لدى الثلاثة الأخيرين).</w:t>
       </w:r>
     </w:p>
     <w:p>
@@ -4694,7 +4704,7 @@
           <w:szCs w:val="24"/>
           <w:rtl w:val="1"/>
         </w:rPr>
-        <w:t xml:space="preserve">مستوى الصف جيد (نسبة النجاح 100%، المعدل 76.88/100). أهداف خطة الدعم:</w:t>
+        <w:t xml:space="preserve">مستوى الصف جيد (نسبة النجاح 100%، المعدل 77.5/100). أهداف خطة الدعم:</w:t>
       </w:r>
     </w:p>
     <w:p>
@@ -4724,7 +4734,7 @@
           <w:szCs w:val="24"/>
           <w:rtl w:val="1"/>
         </w:rPr>
-        <w:t xml:space="preserve">نشر المتطابقات الشهيرة وحساب القيمة العددية مع الأعداد السالبة (لكامل الصف).</w:t>
+        <w:t xml:space="preserve">نشر المتطابقات الشهيرة وحساب القيمة العددية مع الأعداد السالبة (لكامل الصف، وبشكل مكثف لبتول وعباس).</w:t>
       </w:r>
     </w:p>
     <w:p>
@@ -4754,7 +4764,7 @@
           <w:szCs w:val="24"/>
           <w:rtl w:val="1"/>
         </w:rPr>
-        <w:t xml:space="preserve">توحيد المقامات والاختزال في العمليات على الكسور.</w:t>
+        <w:t xml:space="preserve">توحيد المقامات والاختزال في العمليات على الكسور (خصوصاً علي حيدر).</w:t>
       </w:r>
     </w:p>
     <w:p>
@@ -4784,7 +4794,7 @@
           <w:szCs w:val="24"/>
           <w:rtl w:val="1"/>
         </w:rPr>
-        <w:t xml:space="preserve">حل المعادلات من الدرجة الأولى (فك الأقواس ونقل الحدود).</w:t>
+        <w:t xml:space="preserve">حل المعادلات من الدرجة الأولى (فك الأقواس ونقل الحدود) لهادي وعباس وعلي.</w:t>
       </w:r>
     </w:p>
     <w:p>

</xml_diff>